<commit_message>
fix: v8 patch — METHODOLOGY single source, date fix, BD-020, .md guide
- Delete 3 template METHODOLOGY.md copies; supporting-docs/METHODOLOGY.md is now
  the single source of truth
- Add applicability note and single-source-of-truth note to METHODOLOGY.md header
- QUICKSTART.md Steps 2-3: explicit cp supporting-docs/METHODOLOGY.md instruction
- SETUP_TEMPLATE.md: explicit METHODOLOGY.md copy step added
- MIGRATION-v7-to-v8.md: source path corrected to supporting-docs/METHODOLOGY.md
- README.md: v8 date fixed (Mar 2026 -> Mar 29, 2026); template comparison table
  updated to show METHODOLOGY.md is copied from supporting-docs/
- BACKLOG.md: BD-020 added to Active v9 Scope (C++ server support analysis)
- supporting-docs/guides/ai-agent-config-pack-v8-guide.md: markdown version of
  the v8 guide created; v9 format note added at top
- supporting-docs/guides/ai-agent-config-pack-v8-guide.docx: date and Step 11
  reference corrected
- CHANGELOG.md: note added that v9+ guides will be .md only
</commit_message>
<xml_diff>
--- a/supporting-docs/guides/ai-agent-config-pack-v8-guide.docx
+++ b/supporting-docs/guides/ai-agent-config-pack-v8-guide.docx
@@ -13,7 +13,7 @@
     <w:p/>
     <w:p>
       <w:r>
-        <w:t xml:space="preserve">**Version 8 | March 2026**</w:t>
+        <w:t xml:space="preserve">**Version 8 | March 29, 2026**</w:t>
       </w:r>
     </w:p>
     <w:p>
@@ -620,7 +620,7 @@
     </w:p>
     <w:p>
       <w:r>
-        <w:t xml:space="preserve">3. Upload to Project Knowledge: METHODOLOGY.md (from project repo) and supporting-docs/PROMPT-TEMPLATES.md (from pack)</w:t>
+        <w:t xml:space="preserve">3. Upload to Project Knowledge: METHODOLOGY.md (from your project repo root — copied there in Step 2) and supporting-docs/PROMPT-TEMPLATES.md (from pack)</w:t>
       </w:r>
     </w:p>
     <w:p/>

</xml_diff>